<commit_message>
added comments and added website icon
</commit_message>
<xml_diff>
--- a/WMD-Assignment-Documentation.docx
+++ b/WMD-Assignment-Documentation.docx
@@ -219,6 +219,9 @@
       <w:r>
         <w:t>.</w:t>
       </w:r>
+      <w:r>
+        <w:t xml:space="preserve"> </w:t>
+      </w:r>
     </w:p>
     <w:p>
       <w:pPr>
@@ -300,15 +303,7 @@
         <w:t xml:space="preserve"> </w:t>
       </w:r>
       <w:r>
-        <w:t>saving, allowing customers to shop anytime and from any location (Al-</w:t>
-      </w:r>
-      <w:proofErr w:type="spellStart"/>
-      <w:r>
-        <w:t>Debei</w:t>
-      </w:r>
-      <w:proofErr w:type="spellEnd"/>
-      <w:r>
-        <w:t xml:space="preserve"> et al., 2015, p. 712). Therefore, this website aims to leverage these advantages to improve customer engagement and support business growth.</w:t>
+        <w:t>saving, allowing customers to shop anytime and from any location (Al-Debei et al., 2015, p. 712). Therefore, this website aims to leverage these advantages to improve customer engagement and support business growth.</w:t>
       </w:r>
     </w:p>
     <w:p/>
@@ -465,7 +460,22 @@
         <w:t xml:space="preserve">Should be </w:t>
       </w:r>
       <w:r>
-        <w:t>tech savvy</w:t>
+        <w:t xml:space="preserve">tech </w:t>
+      </w:r>
+      <w:r>
+        <w:t>savvy</w:t>
+      </w:r>
+      <w:r>
+        <w:t xml:space="preserve">. </w:t>
+      </w:r>
+      <w:r>
+        <w:t xml:space="preserve">an individual </w:t>
+      </w:r>
+      <w:r>
+        <w:t>should have</w:t>
+      </w:r>
+      <w:r>
+        <w:t xml:space="preserve"> strong knowledge with modern digital tools</w:t>
       </w:r>
       <w:r>
         <w:t>.</w:t>
@@ -480,13 +490,7 @@
         </w:numPr>
       </w:pPr>
       <w:r>
-        <w:t>Familiar with smartphones</w:t>
-      </w:r>
-      <w:r>
-        <w:t xml:space="preserve"> </w:t>
-      </w:r>
-      <w:r>
-        <w:t>and online shopping</w:t>
+        <w:t>Familiar with smartphone online shopping</w:t>
       </w:r>
       <w:r>
         <w:t>.</w:t>
@@ -1019,151 +1023,656 @@
     </w:p>
     <w:p>
       <w:pPr>
-        <w:tabs>
-          <w:tab w:val="left" w:pos="1260"/>
-        </w:tabs>
-      </w:pPr>
-      <w:r>
-        <w:t>Canva</w:t>
-      </w:r>
-      <w:r>
-        <w:rPr>
-          <w:b/>
-          <w:bCs/>
-        </w:rPr>
-        <w:t xml:space="preserve">- </w:t>
-      </w:r>
-      <w:r>
-        <w:t xml:space="preserve">To make </w:t>
-      </w:r>
-      <w:r>
-        <w:t>page templat</w:t>
-      </w:r>
-      <w:r>
-        <w:t>e</w:t>
-      </w:r>
-    </w:p>
-    <w:p>
-      <w:pPr>
-        <w:tabs>
-          <w:tab w:val="left" w:pos="1260"/>
-        </w:tabs>
-        <w:rPr>
-          <w:b/>
-          <w:bCs/>
-        </w:rPr>
-      </w:pPr>
-      <w:proofErr w:type="spellStart"/>
-      <w:r>
-        <w:t>Pixabay</w:t>
-      </w:r>
-      <w:proofErr w:type="spellEnd"/>
-      <w:r>
+        <w:numPr>
+          <w:ilvl w:val="0"/>
+          <w:numId w:val="13"/>
+        </w:numPr>
+        <w:tabs>
+          <w:tab w:val="left" w:pos="1260"/>
+        </w:tabs>
+        <w:rPr>
+          <w:lang w:val="en-BW"/>
+        </w:rPr>
+      </w:pPr>
+      <w:r>
+        <w:rPr>
+          <w:lang w:val="en-BW"/>
+        </w:rPr>
+        <w:t xml:space="preserve">Canva- To make page template </w:t>
+      </w:r>
+      <w:r>
+        <w:rPr>
+          <w:i/>
+          <w:iCs/>
+          <w:lang w:val="en-BW"/>
+        </w:rPr>
+        <w:t>(Canva is an online design tool used to create visual layouts and templates easily)</w:t>
+      </w:r>
+    </w:p>
+    <w:p>
+      <w:pPr>
+        <w:numPr>
+          <w:ilvl w:val="0"/>
+          <w:numId w:val="13"/>
+        </w:numPr>
+        <w:tabs>
+          <w:tab w:val="left" w:pos="1260"/>
+        </w:tabs>
+        <w:rPr>
+          <w:lang w:val="en-BW"/>
+        </w:rPr>
+      </w:pPr>
+      <w:r>
+        <w:rPr>
+          <w:lang w:val="en-BW"/>
+        </w:rPr>
+        <w:t xml:space="preserve">Pixabay – Photo visuals of the products </w:t>
+      </w:r>
+      <w:r>
+        <w:rPr>
+          <w:i/>
+          <w:iCs/>
+          <w:lang w:val="en-BW"/>
+        </w:rPr>
+        <w:t>(Pixabay is a free website that provides images and graphics for use in projects)</w:t>
+      </w:r>
+    </w:p>
+    <w:p>
+      <w:pPr>
+        <w:numPr>
+          <w:ilvl w:val="0"/>
+          <w:numId w:val="13"/>
+        </w:numPr>
+        <w:tabs>
+          <w:tab w:val="left" w:pos="1260"/>
+        </w:tabs>
+        <w:rPr>
+          <w:lang w:val="en-BW"/>
+        </w:rPr>
+      </w:pPr>
+      <w:r>
+        <w:rPr>
+          <w:lang w:val="en-BW"/>
+        </w:rPr>
+        <w:t xml:space="preserve">Visual Studio-code editor </w:t>
+      </w:r>
+      <w:r>
+        <w:rPr>
+          <w:i/>
+          <w:iCs/>
+          <w:lang w:val="en-BW"/>
+        </w:rPr>
+        <w:t>(Visual Studio Code is a software application used for writing and editing code)</w:t>
+      </w:r>
+    </w:p>
+    <w:p>
+      <w:pPr>
+        <w:numPr>
+          <w:ilvl w:val="0"/>
+          <w:numId w:val="13"/>
+        </w:numPr>
+        <w:tabs>
+          <w:tab w:val="left" w:pos="1260"/>
+        </w:tabs>
+        <w:rPr>
+          <w:lang w:val="en-BW"/>
+        </w:rPr>
+      </w:pPr>
+      <w:r>
+        <w:rPr>
+          <w:lang w:val="en-BW"/>
+        </w:rPr>
+        <w:t xml:space="preserve">Web Browsers (Google Chrome, Safari, Microsoft Edge)-for testing website </w:t>
+      </w:r>
+      <w:r>
+        <w:rPr>
+          <w:i/>
+          <w:iCs/>
+          <w:lang w:val="en-BW"/>
+        </w:rPr>
+        <w:t>(Web browsers are applications used to access and test websites on the internet)</w:t>
+      </w:r>
+    </w:p>
+    <w:p>
+      <w:pPr>
+        <w:numPr>
+          <w:ilvl w:val="0"/>
+          <w:numId w:val="13"/>
+        </w:numPr>
+        <w:tabs>
+          <w:tab w:val="left" w:pos="1260"/>
+        </w:tabs>
+        <w:rPr>
+          <w:lang w:val="en-BW"/>
+        </w:rPr>
+      </w:pPr>
+      <w:r>
+        <w:rPr>
+          <w:lang w:val="en-BW"/>
+        </w:rPr>
+        <w:t>GitHub Pages</w:t>
+      </w:r>
+      <w:r>
+        <w:rPr>
+          <w:lang w:val="en-BW"/>
+        </w:rPr>
+        <w:t>-</w:t>
+      </w:r>
+      <w:r>
+        <w:rPr>
+          <w:lang w:val="en-BW"/>
+        </w:rPr>
+        <w:t xml:space="preserve">for hosting the website </w:t>
+      </w:r>
+      <w:r>
+        <w:rPr>
+          <w:i/>
+          <w:iCs/>
+          <w:lang w:val="en-BW"/>
+        </w:rPr>
+        <w:t>(GitHub Pages is a free web hosting service for publishing websites online)</w:t>
+      </w:r>
+    </w:p>
+    <w:p>
+      <w:pPr>
+        <w:numPr>
+          <w:ilvl w:val="0"/>
+          <w:numId w:val="13"/>
+        </w:numPr>
+        <w:tabs>
+          <w:tab w:val="left" w:pos="1260"/>
+        </w:tabs>
+        <w:rPr>
+          <w:lang w:val="en-BW"/>
+        </w:rPr>
+      </w:pPr>
+      <w:r>
+        <w:rPr>
+          <w:lang w:val="en-BW"/>
+        </w:rPr>
+        <w:t xml:space="preserve">HTML- create the structure of the website </w:t>
+      </w:r>
+      <w:r>
+        <w:rPr>
+          <w:i/>
+          <w:iCs/>
+          <w:lang w:val="en-BW"/>
+        </w:rPr>
+        <w:t>(HTML is a markup language used to build the structure of web pages)</w:t>
+      </w:r>
+    </w:p>
+    <w:p>
+      <w:pPr>
+        <w:numPr>
+          <w:ilvl w:val="0"/>
+          <w:numId w:val="13"/>
+        </w:numPr>
+        <w:tabs>
+          <w:tab w:val="left" w:pos="1260"/>
+        </w:tabs>
+        <w:rPr>
+          <w:lang w:val="en-BW"/>
+        </w:rPr>
+      </w:pPr>
+      <w:r>
+        <w:rPr>
+          <w:lang w:val="en-BW"/>
+        </w:rPr>
+        <w:t xml:space="preserve">CSS-used in styling and layout of the website </w:t>
+      </w:r>
+      <w:r>
+        <w:rPr>
+          <w:i/>
+          <w:iCs/>
+          <w:lang w:val="en-BW"/>
+        </w:rPr>
+        <w:t>(CSS is a style sheet language used to design and format web pages)</w:t>
+      </w:r>
+    </w:p>
+    <w:p>
+      <w:pPr>
+        <w:numPr>
+          <w:ilvl w:val="0"/>
+          <w:numId w:val="13"/>
+        </w:numPr>
+        <w:tabs>
+          <w:tab w:val="left" w:pos="1260"/>
+        </w:tabs>
+        <w:rPr>
+          <w:lang w:val="en-BW"/>
+        </w:rPr>
+      </w:pPr>
+      <w:r>
+        <w:rPr>
+          <w:lang w:val="en-BW"/>
+        </w:rPr>
+        <w:t xml:space="preserve">JAVASCRIPT-used in interactivity of the website </w:t>
+      </w:r>
+      <w:r>
+        <w:rPr>
+          <w:i/>
+          <w:iCs/>
+          <w:lang w:val="en-BW"/>
+        </w:rPr>
+        <w:t>(JavaScript is a programming language used to make web pages interactive)</w:t>
+      </w:r>
+    </w:p>
+    <w:p>
+      <w:pPr>
+        <w:numPr>
+          <w:ilvl w:val="0"/>
+          <w:numId w:val="13"/>
+        </w:numPr>
+        <w:tabs>
+          <w:tab w:val="left" w:pos="1260"/>
+        </w:tabs>
+        <w:rPr>
+          <w:lang w:val="en-BW"/>
+        </w:rPr>
+      </w:pPr>
+      <w:r>
+        <w:rPr>
+          <w:lang w:val="en-BW"/>
+        </w:rPr>
+        <w:t xml:space="preserve">BOOTSTRAP FRAMEWORK-for responsive design </w:t>
+      </w:r>
+      <w:r>
+        <w:rPr>
+          <w:i/>
+          <w:iCs/>
+          <w:lang w:val="en-BW"/>
+        </w:rPr>
+        <w:t>(Bootstrap is a framework used to create responsive and mobile-friendly websites)</w:t>
+      </w:r>
+    </w:p>
+    <w:p>
+      <w:pPr>
+        <w:tabs>
+          <w:tab w:val="left" w:pos="1260"/>
+        </w:tabs>
+        <w:rPr>
+          <w:sz w:val="22"/>
+          <w:szCs w:val="22"/>
+        </w:rPr>
+      </w:pPr>
+    </w:p>
+    <w:p>
+      <w:pPr>
+        <w:tabs>
+          <w:tab w:val="left" w:pos="1260"/>
+        </w:tabs>
+        <w:rPr>
+          <w:sz w:val="22"/>
+          <w:szCs w:val="22"/>
+        </w:rPr>
+      </w:pPr>
+    </w:p>
+    <w:p>
+      <w:pPr>
+        <w:tabs>
+          <w:tab w:val="left" w:pos="1260"/>
+        </w:tabs>
+        <w:rPr>
+          <w:sz w:val="22"/>
+          <w:szCs w:val="22"/>
+        </w:rPr>
+      </w:pPr>
+    </w:p>
+    <w:p>
+      <w:pPr>
+        <w:tabs>
+          <w:tab w:val="left" w:pos="1260"/>
+        </w:tabs>
+        <w:rPr>
+          <w:b/>
+          <w:bCs/>
+          <w:sz w:val="22"/>
+          <w:szCs w:val="22"/>
+        </w:rPr>
+      </w:pPr>
+      <w:r>
+        <w:rPr>
+          <w:b/>
+          <w:bCs/>
+          <w:sz w:val="22"/>
+          <w:szCs w:val="22"/>
+        </w:rPr>
+        <w:t>Publishing and Promoting</w:t>
+      </w:r>
+    </w:p>
+    <w:p>
+      <w:pPr>
+        <w:tabs>
+          <w:tab w:val="left" w:pos="1260"/>
+        </w:tabs>
+        <w:rPr>
+          <w:sz w:val="22"/>
+          <w:szCs w:val="22"/>
+        </w:rPr>
+      </w:pPr>
+      <w:r>
+        <w:rPr>
+          <w:sz w:val="22"/>
+          <w:szCs w:val="22"/>
+        </w:rPr>
+        <w:t>DIME SUITS w</w:t>
+      </w:r>
+      <w:r>
+        <w:rPr>
+          <w:sz w:val="22"/>
+          <w:szCs w:val="22"/>
+        </w:rPr>
+        <w:t>as</w:t>
+      </w:r>
+      <w:r>
+        <w:rPr>
+          <w:sz w:val="22"/>
+          <w:szCs w:val="22"/>
+        </w:rPr>
         <w:t xml:space="preserve"> </w:t>
       </w:r>
       <w:r>
-        <w:t>–</w:t>
-      </w:r>
-      <w:r>
+        <w:rPr>
+          <w:sz w:val="22"/>
+          <w:szCs w:val="22"/>
+        </w:rPr>
+        <w:t>uploaded and</w:t>
+      </w:r>
+      <w:r>
+        <w:rPr>
+          <w:sz w:val="22"/>
+          <w:szCs w:val="22"/>
+        </w:rPr>
+        <w:t xml:space="preserve"> hosted on </w:t>
+      </w:r>
+      <w:r>
+        <w:rPr>
+          <w:sz w:val="22"/>
+          <w:szCs w:val="22"/>
+        </w:rPr>
+        <w:t>GitHub</w:t>
+      </w:r>
+      <w:r>
+        <w:rPr>
+          <w:sz w:val="22"/>
+          <w:szCs w:val="22"/>
+        </w:rPr>
+        <w:t xml:space="preserve"> Pages </w:t>
+      </w:r>
+      <w:r>
+        <w:rPr>
+          <w:sz w:val="22"/>
+          <w:szCs w:val="22"/>
+        </w:rPr>
+        <w:t>,</w:t>
+      </w:r>
+      <w:r>
+        <w:rPr>
+          <w:sz w:val="22"/>
+          <w:szCs w:val="22"/>
+        </w:rPr>
         <w:t xml:space="preserve"> </w:t>
       </w:r>
       <w:r>
-        <w:t>Photo visuals of the products</w:t>
-      </w:r>
-    </w:p>
-    <w:p>
-      <w:pPr>
-        <w:tabs>
-          <w:tab w:val="left" w:pos="1260"/>
-        </w:tabs>
-      </w:pPr>
-      <w:r>
-        <w:t>Visual S</w:t>
-      </w:r>
-      <w:r>
-        <w:t>t</w:t>
-      </w:r>
-      <w:r>
-        <w:t>udio</w:t>
-      </w:r>
-      <w:r>
-        <w:t>-code editor</w:t>
-      </w:r>
-      <w:r>
+        <w:rPr>
+          <w:sz w:val="22"/>
+          <w:szCs w:val="22"/>
+        </w:rPr>
+        <w:t xml:space="preserve">a repository was crated to store all </w:t>
+      </w:r>
+      <w:r>
+        <w:rPr>
+          <w:sz w:val="22"/>
+          <w:szCs w:val="22"/>
+        </w:rPr>
+        <w:t>the website files.</w:t>
+      </w:r>
+      <w:r>
+        <w:rPr>
+          <w:sz w:val="22"/>
+          <w:szCs w:val="22"/>
+        </w:rPr>
         <w:t xml:space="preserve"> </w:t>
       </w:r>
-    </w:p>
-    <w:p>
-      <w:pPr>
-        <w:tabs>
-          <w:tab w:val="left" w:pos="1260"/>
-        </w:tabs>
-      </w:pPr>
-      <w:r>
-        <w:t xml:space="preserve">Web </w:t>
-      </w:r>
-      <w:r>
-        <w:t>Browsers</w:t>
-      </w:r>
-      <w:r>
+      <w:r>
+        <w:rPr>
+          <w:sz w:val="22"/>
+          <w:szCs w:val="22"/>
+        </w:rPr>
+        <w:t>VS</w:t>
+      </w:r>
+      <w:r>
+        <w:rPr>
+          <w:sz w:val="22"/>
+          <w:szCs w:val="22"/>
+        </w:rPr>
+        <w:t xml:space="preserve"> CODE w</w:t>
+      </w:r>
+      <w:r>
+        <w:rPr>
+          <w:sz w:val="22"/>
+          <w:szCs w:val="22"/>
+        </w:rPr>
+        <w:t>as</w:t>
+      </w:r>
+      <w:r>
+        <w:rPr>
+          <w:sz w:val="22"/>
+          <w:szCs w:val="22"/>
+        </w:rPr>
+        <w:t xml:space="preserve"> used to deploy it on </w:t>
+      </w:r>
+      <w:r>
+        <w:rPr>
+          <w:sz w:val="22"/>
+          <w:szCs w:val="22"/>
+        </w:rPr>
+        <w:t>GitHub</w:t>
+      </w:r>
+      <w:r>
+        <w:rPr>
+          <w:sz w:val="22"/>
+          <w:szCs w:val="22"/>
+        </w:rPr>
         <w:t xml:space="preserve"> </w:t>
       </w:r>
       <w:r>
-        <w:t>(Google Chrome ,</w:t>
-      </w:r>
-      <w:r>
-        <w:t>Safari, Microsoft</w:t>
-      </w:r>
-      <w:r>
-        <w:t xml:space="preserve"> Edge)</w:t>
-      </w:r>
-      <w:r>
+        <w:rPr>
+          <w:sz w:val="22"/>
+          <w:szCs w:val="22"/>
+        </w:rPr>
+        <w:t xml:space="preserve">Pages </w:t>
+      </w:r>
+      <w:r>
+        <w:rPr>
+          <w:sz w:val="22"/>
+          <w:szCs w:val="22"/>
+        </w:rPr>
+        <w:t xml:space="preserve">using </w:t>
+      </w:r>
+      <w:r>
+        <w:rPr>
+          <w:sz w:val="22"/>
+          <w:szCs w:val="22"/>
+        </w:rPr>
+        <w:t>GitHub commands</w:t>
+      </w:r>
+      <w:r>
+        <w:rPr>
+          <w:sz w:val="22"/>
+          <w:szCs w:val="22"/>
+        </w:rPr>
+        <w:t>.</w:t>
+      </w:r>
+      <w:r>
+        <w:rPr>
+          <w:sz w:val="22"/>
+          <w:szCs w:val="22"/>
+        </w:rPr>
+        <w:t>GitHub Pages was then enabled to make the website accessible on the internet.</w:t>
+      </w:r>
+    </w:p>
+    <w:p>
+      <w:pPr>
+        <w:tabs>
+          <w:tab w:val="left" w:pos="1260"/>
+        </w:tabs>
+        <w:rPr>
+          <w:sz w:val="22"/>
+          <w:szCs w:val="22"/>
+        </w:rPr>
+      </w:pPr>
+    </w:p>
+    <w:p>
+      <w:pPr>
+        <w:tabs>
+          <w:tab w:val="left" w:pos="1260"/>
+        </w:tabs>
+        <w:rPr>
+          <w:b/>
+          <w:bCs/>
+          <w:sz w:val="22"/>
+          <w:szCs w:val="22"/>
+        </w:rPr>
+      </w:pPr>
+      <w:r>
+        <w:rPr>
+          <w:b/>
+          <w:bCs/>
+          <w:sz w:val="22"/>
+          <w:szCs w:val="22"/>
+        </w:rPr>
+        <w:t>Tools Used</w:t>
+      </w:r>
+    </w:p>
+    <w:p>
+      <w:pPr>
+        <w:tabs>
+          <w:tab w:val="left" w:pos="1260"/>
+        </w:tabs>
+        <w:rPr>
+          <w:sz w:val="22"/>
+          <w:szCs w:val="22"/>
+        </w:rPr>
+      </w:pPr>
+      <w:r>
+        <w:rPr>
+          <w:sz w:val="22"/>
+          <w:szCs w:val="22"/>
+        </w:rPr>
+        <w:t>Vs Code</w:t>
+      </w:r>
+      <w:r>
+        <w:rPr>
+          <w:sz w:val="22"/>
+          <w:szCs w:val="22"/>
+        </w:rPr>
+        <w:t xml:space="preserve"> – for editing </w:t>
+      </w:r>
+      <w:r>
+        <w:rPr>
+          <w:sz w:val="22"/>
+          <w:szCs w:val="22"/>
+        </w:rPr>
+        <w:t>and manage project files</w:t>
+      </w:r>
+    </w:p>
+    <w:p>
+      <w:pPr>
+        <w:tabs>
+          <w:tab w:val="left" w:pos="1260"/>
+        </w:tabs>
+        <w:rPr>
+          <w:sz w:val="22"/>
+          <w:szCs w:val="22"/>
+        </w:rPr>
+      </w:pPr>
+      <w:r>
+        <w:rPr>
+          <w:sz w:val="22"/>
+          <w:szCs w:val="22"/>
+        </w:rPr>
+        <w:t>Git</w:t>
+      </w:r>
+      <w:r>
+        <w:rPr>
+          <w:sz w:val="22"/>
+          <w:szCs w:val="22"/>
+        </w:rPr>
+        <w:t xml:space="preserve"> – for uploading and tracking </w:t>
+      </w:r>
+      <w:r>
+        <w:rPr>
+          <w:sz w:val="22"/>
+          <w:szCs w:val="22"/>
+        </w:rPr>
+        <w:t>changes</w:t>
+      </w:r>
+    </w:p>
+    <w:p>
+      <w:pPr>
+        <w:tabs>
+          <w:tab w:val="left" w:pos="1260"/>
+        </w:tabs>
+        <w:rPr>
+          <w:sz w:val="22"/>
+          <w:szCs w:val="22"/>
+        </w:rPr>
+      </w:pPr>
+      <w:r>
+        <w:rPr>
+          <w:sz w:val="22"/>
+          <w:szCs w:val="22"/>
+        </w:rPr>
+        <w:t>Git</w:t>
+      </w:r>
+      <w:r>
+        <w:rPr>
+          <w:sz w:val="22"/>
+          <w:szCs w:val="22"/>
+        </w:rPr>
+        <w:t>Hub</w:t>
+      </w:r>
+      <w:r>
+        <w:rPr>
+          <w:sz w:val="22"/>
+          <w:szCs w:val="22"/>
+        </w:rPr>
         <w:t>-</w:t>
       </w:r>
       <w:r>
-        <w:t xml:space="preserve">for </w:t>
-      </w:r>
-      <w:r>
-        <w:t xml:space="preserve">testing </w:t>
-      </w:r>
-      <w:r>
-        <w:t>website</w:t>
-      </w:r>
-    </w:p>
-    <w:p>
-      <w:pPr>
-        <w:tabs>
-          <w:tab w:val="left" w:pos="1260"/>
-        </w:tabs>
-      </w:pPr>
-      <w:r>
+        <w:rPr>
+          <w:sz w:val="22"/>
+          <w:szCs w:val="22"/>
+        </w:rPr>
+        <w:t xml:space="preserve"> for file managem</w:t>
+      </w:r>
+      <w:r>
+        <w:rPr>
+          <w:sz w:val="22"/>
+          <w:szCs w:val="22"/>
+        </w:rPr>
+        <w:t>ent</w:t>
+      </w:r>
+    </w:p>
+    <w:p>
+      <w:pPr>
+        <w:tabs>
+          <w:tab w:val="left" w:pos="1260"/>
+        </w:tabs>
+        <w:rPr>
+          <w:sz w:val="22"/>
+          <w:szCs w:val="22"/>
+        </w:rPr>
+      </w:pPr>
+      <w:r>
+        <w:rPr>
+          <w:sz w:val="22"/>
+          <w:szCs w:val="22"/>
+        </w:rPr>
         <w:t>GitHub Pages</w:t>
       </w:r>
       <w:r>
-        <w:t xml:space="preserve">-hosting </w:t>
-      </w:r>
-      <w:r>
-        <w:t>the website</w:t>
-      </w:r>
-    </w:p>
-    <w:p>
-      <w:pPr>
-        <w:tabs>
-          <w:tab w:val="left" w:pos="1260"/>
-        </w:tabs>
-        <w:rPr>
-          <w:sz w:val="22"/>
-          <w:szCs w:val="22"/>
-        </w:rPr>
-      </w:pPr>
-      <w:r>
-        <w:rPr>
-          <w:sz w:val="22"/>
-          <w:szCs w:val="22"/>
-        </w:rPr>
-        <w:t>HTML</w:t>
-      </w:r>
-      <w:r>
         <w:rPr>
           <w:sz w:val="22"/>
           <w:szCs w:val="22"/>
@@ -1171,6 +1680,10 @@
         <w:t>-</w:t>
       </w:r>
       <w:r>
+        <w:rPr>
+          <w:sz w:val="22"/>
+          <w:szCs w:val="22"/>
+        </w:rPr>
         <w:t xml:space="preserve"> </w:t>
       </w:r>
       <w:r>
@@ -1178,546 +1691,6 @@
           <w:sz w:val="22"/>
           <w:szCs w:val="22"/>
         </w:rPr>
-        <w:t>create the structure of the website</w:t>
-      </w:r>
-    </w:p>
-    <w:p>
-      <w:pPr>
-        <w:tabs>
-          <w:tab w:val="left" w:pos="1260"/>
-        </w:tabs>
-        <w:rPr>
-          <w:sz w:val="22"/>
-          <w:szCs w:val="22"/>
-        </w:rPr>
-      </w:pPr>
-      <w:r>
-        <w:rPr>
-          <w:sz w:val="22"/>
-          <w:szCs w:val="22"/>
-        </w:rPr>
-        <w:t>CSS</w:t>
-      </w:r>
-      <w:r>
-        <w:rPr>
-          <w:sz w:val="22"/>
-          <w:szCs w:val="22"/>
-        </w:rPr>
-        <w:t>-</w:t>
-      </w:r>
-      <w:r>
-        <w:rPr>
-          <w:sz w:val="22"/>
-          <w:szCs w:val="22"/>
-        </w:rPr>
-        <w:t xml:space="preserve">used in </w:t>
-      </w:r>
-      <w:r>
-        <w:rPr>
-          <w:sz w:val="22"/>
-          <w:szCs w:val="22"/>
-        </w:rPr>
-        <w:t>styling and layout</w:t>
-      </w:r>
-      <w:r>
-        <w:rPr>
-          <w:sz w:val="22"/>
-          <w:szCs w:val="22"/>
-        </w:rPr>
-        <w:t xml:space="preserve"> of the website</w:t>
-      </w:r>
-    </w:p>
-    <w:p>
-      <w:pPr>
-        <w:tabs>
-          <w:tab w:val="left" w:pos="1260"/>
-        </w:tabs>
-        <w:rPr>
-          <w:sz w:val="22"/>
-          <w:szCs w:val="22"/>
-        </w:rPr>
-      </w:pPr>
-      <w:r>
-        <w:rPr>
-          <w:sz w:val="22"/>
-          <w:szCs w:val="22"/>
-        </w:rPr>
-        <w:t>JAVASCRIPT</w:t>
-      </w:r>
-      <w:r>
-        <w:rPr>
-          <w:sz w:val="22"/>
-          <w:szCs w:val="22"/>
-        </w:rPr>
-        <w:t>-</w:t>
-      </w:r>
-      <w:r>
-        <w:rPr>
-          <w:sz w:val="22"/>
-          <w:szCs w:val="22"/>
-        </w:rPr>
-        <w:t xml:space="preserve">used in </w:t>
-      </w:r>
-      <w:r>
-        <w:rPr>
-          <w:sz w:val="22"/>
-          <w:szCs w:val="22"/>
-        </w:rPr>
-        <w:t>interactivity</w:t>
-      </w:r>
-      <w:r>
-        <w:rPr>
-          <w:sz w:val="22"/>
-          <w:szCs w:val="22"/>
-        </w:rPr>
-        <w:t xml:space="preserve"> of the website</w:t>
-      </w:r>
-    </w:p>
-    <w:p>
-      <w:pPr>
-        <w:tabs>
-          <w:tab w:val="left" w:pos="1260"/>
-        </w:tabs>
-        <w:rPr>
-          <w:sz w:val="22"/>
-          <w:szCs w:val="22"/>
-        </w:rPr>
-      </w:pPr>
-      <w:r>
-        <w:rPr>
-          <w:sz w:val="22"/>
-          <w:szCs w:val="22"/>
-        </w:rPr>
-        <w:t>BOOTSTRAP FRAMEWORK</w:t>
-      </w:r>
-      <w:r>
-        <w:rPr>
-          <w:sz w:val="22"/>
-          <w:szCs w:val="22"/>
-        </w:rPr>
-        <w:t>-</w:t>
-      </w:r>
-      <w:r>
-        <w:rPr>
-          <w:sz w:val="22"/>
-          <w:szCs w:val="22"/>
-        </w:rPr>
-        <w:t>for responsive</w:t>
-      </w:r>
-      <w:r>
-        <w:rPr>
-          <w:sz w:val="22"/>
-          <w:szCs w:val="22"/>
-        </w:rPr>
-        <w:t xml:space="preserve"> design</w:t>
-      </w:r>
-    </w:p>
-    <w:p>
-      <w:pPr>
-        <w:tabs>
-          <w:tab w:val="left" w:pos="1260"/>
-        </w:tabs>
-        <w:rPr>
-          <w:sz w:val="22"/>
-          <w:szCs w:val="22"/>
-        </w:rPr>
-      </w:pPr>
-    </w:p>
-    <w:p>
-      <w:pPr>
-        <w:tabs>
-          <w:tab w:val="left" w:pos="1260"/>
-        </w:tabs>
-        <w:rPr>
-          <w:sz w:val="22"/>
-          <w:szCs w:val="22"/>
-        </w:rPr>
-      </w:pPr>
-    </w:p>
-    <w:p>
-      <w:pPr>
-        <w:tabs>
-          <w:tab w:val="left" w:pos="1260"/>
-        </w:tabs>
-        <w:rPr>
-          <w:sz w:val="22"/>
-          <w:szCs w:val="22"/>
-        </w:rPr>
-      </w:pPr>
-    </w:p>
-    <w:p>
-      <w:pPr>
-        <w:tabs>
-          <w:tab w:val="left" w:pos="1260"/>
-        </w:tabs>
-        <w:rPr>
-          <w:b/>
-          <w:bCs/>
-          <w:sz w:val="22"/>
-          <w:szCs w:val="22"/>
-        </w:rPr>
-      </w:pPr>
-      <w:r>
-        <w:rPr>
-          <w:b/>
-          <w:bCs/>
-          <w:sz w:val="22"/>
-          <w:szCs w:val="22"/>
-        </w:rPr>
-        <w:t>Publishing and Promoting</w:t>
-      </w:r>
-    </w:p>
-    <w:p>
-      <w:pPr>
-        <w:tabs>
-          <w:tab w:val="left" w:pos="1260"/>
-        </w:tabs>
-        <w:rPr>
-          <w:sz w:val="22"/>
-          <w:szCs w:val="22"/>
-        </w:rPr>
-      </w:pPr>
-      <w:r>
-        <w:rPr>
-          <w:sz w:val="22"/>
-          <w:szCs w:val="22"/>
-        </w:rPr>
-        <w:t>DIME SUITS w</w:t>
-      </w:r>
-      <w:r>
-        <w:rPr>
-          <w:sz w:val="22"/>
-          <w:szCs w:val="22"/>
-        </w:rPr>
-        <w:t>as</w:t>
-      </w:r>
-      <w:r>
-        <w:rPr>
-          <w:sz w:val="22"/>
-          <w:szCs w:val="22"/>
-        </w:rPr>
-        <w:t xml:space="preserve"> </w:t>
-      </w:r>
-      <w:r>
-        <w:rPr>
-          <w:sz w:val="22"/>
-          <w:szCs w:val="22"/>
-        </w:rPr>
-        <w:t>uploaded and</w:t>
-      </w:r>
-      <w:r>
-        <w:rPr>
-          <w:sz w:val="22"/>
-          <w:szCs w:val="22"/>
-        </w:rPr>
-        <w:t xml:space="preserve"> hosted on </w:t>
-      </w:r>
-      <w:r>
-        <w:rPr>
-          <w:sz w:val="22"/>
-          <w:szCs w:val="22"/>
-        </w:rPr>
-        <w:t>GitHub</w:t>
-      </w:r>
-      <w:r>
-        <w:rPr>
-          <w:sz w:val="22"/>
-          <w:szCs w:val="22"/>
-        </w:rPr>
-        <w:t xml:space="preserve"> Pages </w:t>
-      </w:r>
-      <w:r>
-        <w:rPr>
-          <w:sz w:val="22"/>
-          <w:szCs w:val="22"/>
-        </w:rPr>
-        <w:t>,</w:t>
-      </w:r>
-      <w:r>
-        <w:rPr>
-          <w:sz w:val="22"/>
-          <w:szCs w:val="22"/>
-        </w:rPr>
-        <w:t xml:space="preserve"> </w:t>
-      </w:r>
-      <w:r>
-        <w:rPr>
-          <w:sz w:val="22"/>
-          <w:szCs w:val="22"/>
-        </w:rPr>
-        <w:t xml:space="preserve">a repository was crated to store all </w:t>
-      </w:r>
-      <w:r>
-        <w:rPr>
-          <w:sz w:val="22"/>
-          <w:szCs w:val="22"/>
-        </w:rPr>
-        <w:t>the website files.</w:t>
-      </w:r>
-      <w:r>
-        <w:rPr>
-          <w:sz w:val="22"/>
-          <w:szCs w:val="22"/>
-        </w:rPr>
-        <w:t xml:space="preserve"> </w:t>
-      </w:r>
-      <w:r>
-        <w:rPr>
-          <w:sz w:val="22"/>
-          <w:szCs w:val="22"/>
-        </w:rPr>
-        <w:t>VS</w:t>
-      </w:r>
-      <w:r>
-        <w:rPr>
-          <w:sz w:val="22"/>
-          <w:szCs w:val="22"/>
-        </w:rPr>
-        <w:t xml:space="preserve"> CODE w</w:t>
-      </w:r>
-      <w:r>
-        <w:rPr>
-          <w:sz w:val="22"/>
-          <w:szCs w:val="22"/>
-        </w:rPr>
-        <w:t>as</w:t>
-      </w:r>
-      <w:r>
-        <w:rPr>
-          <w:sz w:val="22"/>
-          <w:szCs w:val="22"/>
-        </w:rPr>
-        <w:t xml:space="preserve"> used to deploy it on </w:t>
-      </w:r>
-      <w:r>
-        <w:rPr>
-          <w:sz w:val="22"/>
-          <w:szCs w:val="22"/>
-        </w:rPr>
-        <w:t>GitHub</w:t>
-      </w:r>
-      <w:r>
-        <w:rPr>
-          <w:sz w:val="22"/>
-          <w:szCs w:val="22"/>
-        </w:rPr>
-        <w:t xml:space="preserve"> </w:t>
-      </w:r>
-      <w:r>
-        <w:rPr>
-          <w:sz w:val="22"/>
-          <w:szCs w:val="22"/>
-        </w:rPr>
-        <w:t xml:space="preserve">Pages </w:t>
-      </w:r>
-      <w:r>
-        <w:rPr>
-          <w:sz w:val="22"/>
-          <w:szCs w:val="22"/>
-        </w:rPr>
-        <w:t xml:space="preserve">using </w:t>
-      </w:r>
-      <w:r>
-        <w:rPr>
-          <w:sz w:val="22"/>
-          <w:szCs w:val="22"/>
-        </w:rPr>
-        <w:t>GitHub commands</w:t>
-      </w:r>
-      <w:r>
-        <w:rPr>
-          <w:sz w:val="22"/>
-          <w:szCs w:val="22"/>
-        </w:rPr>
-        <w:t>.</w:t>
-      </w:r>
-      <w:r>
-        <w:rPr>
-          <w:sz w:val="22"/>
-          <w:szCs w:val="22"/>
-        </w:rPr>
-        <w:t>GitHub Pages was then enabled to make the website accessible on the internet.</w:t>
-      </w:r>
-    </w:p>
-    <w:p>
-      <w:pPr>
-        <w:tabs>
-          <w:tab w:val="left" w:pos="1260"/>
-        </w:tabs>
-        <w:rPr>
-          <w:sz w:val="22"/>
-          <w:szCs w:val="22"/>
-        </w:rPr>
-      </w:pPr>
-    </w:p>
-    <w:p>
-      <w:pPr>
-        <w:tabs>
-          <w:tab w:val="left" w:pos="1260"/>
-        </w:tabs>
-        <w:rPr>
-          <w:b/>
-          <w:bCs/>
-          <w:sz w:val="22"/>
-          <w:szCs w:val="22"/>
-        </w:rPr>
-      </w:pPr>
-      <w:r>
-        <w:rPr>
-          <w:b/>
-          <w:bCs/>
-          <w:sz w:val="22"/>
-          <w:szCs w:val="22"/>
-        </w:rPr>
-        <w:t>Tools Used</w:t>
-      </w:r>
-    </w:p>
-    <w:p>
-      <w:pPr>
-        <w:tabs>
-          <w:tab w:val="left" w:pos="1260"/>
-        </w:tabs>
-        <w:rPr>
-          <w:sz w:val="22"/>
-          <w:szCs w:val="22"/>
-        </w:rPr>
-      </w:pPr>
-      <w:r>
-        <w:rPr>
-          <w:sz w:val="22"/>
-          <w:szCs w:val="22"/>
-        </w:rPr>
-        <w:t>Vs Code</w:t>
-      </w:r>
-      <w:r>
-        <w:rPr>
-          <w:sz w:val="22"/>
-          <w:szCs w:val="22"/>
-        </w:rPr>
-        <w:t xml:space="preserve"> – for editing </w:t>
-      </w:r>
-      <w:r>
-        <w:rPr>
-          <w:sz w:val="22"/>
-          <w:szCs w:val="22"/>
-        </w:rPr>
-        <w:t>and manage project files</w:t>
-      </w:r>
-    </w:p>
-    <w:p>
-      <w:pPr>
-        <w:tabs>
-          <w:tab w:val="left" w:pos="1260"/>
-        </w:tabs>
-        <w:rPr>
-          <w:sz w:val="22"/>
-          <w:szCs w:val="22"/>
-        </w:rPr>
-      </w:pPr>
-      <w:r>
-        <w:rPr>
-          <w:sz w:val="22"/>
-          <w:szCs w:val="22"/>
-        </w:rPr>
-        <w:t>Git</w:t>
-      </w:r>
-      <w:r>
-        <w:rPr>
-          <w:sz w:val="22"/>
-          <w:szCs w:val="22"/>
-        </w:rPr>
-        <w:t xml:space="preserve"> – for uploading and tracking </w:t>
-      </w:r>
-      <w:r>
-        <w:rPr>
-          <w:sz w:val="22"/>
-          <w:szCs w:val="22"/>
-        </w:rPr>
-        <w:t>changes</w:t>
-      </w:r>
-    </w:p>
-    <w:p>
-      <w:pPr>
-        <w:tabs>
-          <w:tab w:val="left" w:pos="1260"/>
-        </w:tabs>
-        <w:rPr>
-          <w:sz w:val="22"/>
-          <w:szCs w:val="22"/>
-        </w:rPr>
-      </w:pPr>
-      <w:r>
-        <w:rPr>
-          <w:sz w:val="22"/>
-          <w:szCs w:val="22"/>
-        </w:rPr>
-        <w:t>Git</w:t>
-      </w:r>
-      <w:r>
-        <w:rPr>
-          <w:sz w:val="22"/>
-          <w:szCs w:val="22"/>
-        </w:rPr>
-        <w:t>Hub</w:t>
-      </w:r>
-      <w:r>
-        <w:rPr>
-          <w:sz w:val="22"/>
-          <w:szCs w:val="22"/>
-        </w:rPr>
-        <w:t>-</w:t>
-      </w:r>
-      <w:r>
-        <w:rPr>
-          <w:sz w:val="22"/>
-          <w:szCs w:val="22"/>
-        </w:rPr>
-        <w:t xml:space="preserve"> for file managem</w:t>
-      </w:r>
-      <w:r>
-        <w:rPr>
-          <w:sz w:val="22"/>
-          <w:szCs w:val="22"/>
-        </w:rPr>
-        <w:t>ent</w:t>
-      </w:r>
-    </w:p>
-    <w:p>
-      <w:pPr>
-        <w:tabs>
-          <w:tab w:val="left" w:pos="1260"/>
-        </w:tabs>
-        <w:rPr>
-          <w:sz w:val="22"/>
-          <w:szCs w:val="22"/>
-        </w:rPr>
-      </w:pPr>
-      <w:r>
-        <w:rPr>
-          <w:sz w:val="22"/>
-          <w:szCs w:val="22"/>
-        </w:rPr>
-        <w:t>GitHub Pages</w:t>
-      </w:r>
-      <w:r>
-        <w:rPr>
-          <w:sz w:val="22"/>
-          <w:szCs w:val="22"/>
-        </w:rPr>
-        <w:t>-</w:t>
-      </w:r>
-      <w:r>
-        <w:rPr>
-          <w:sz w:val="22"/>
-          <w:szCs w:val="22"/>
-        </w:rPr>
-        <w:t xml:space="preserve"> </w:t>
-      </w:r>
-      <w:r>
-        <w:rPr>
-          <w:sz w:val="22"/>
-          <w:szCs w:val="22"/>
-        </w:rPr>
         <w:t>for hosting the website</w:t>
       </w:r>
     </w:p>
@@ -1790,17 +1763,8 @@
           <w:sz w:val="22"/>
           <w:szCs w:val="22"/>
         </w:rPr>
-        <w:t xml:space="preserve">git </w:t>
-      </w:r>
-      <w:proofErr w:type="spellStart"/>
-      <w:r>
-        <w:rPr>
-          <w:sz w:val="22"/>
-          <w:szCs w:val="22"/>
-        </w:rPr>
-        <w:t>init</w:t>
-      </w:r>
-      <w:proofErr w:type="spellEnd"/>
+        <w:t>git init</w:t>
+      </w:r>
     </w:p>
     <w:p>
       <w:pPr>
@@ -2110,24 +2074,6 @@
           <w:sz w:val="22"/>
           <w:szCs w:val="22"/>
         </w:rPr>
-        <w:t>Adding the link to business profile</w:t>
-      </w:r>
-    </w:p>
-    <w:p>
-      <w:pPr>
-        <w:tabs>
-          <w:tab w:val="left" w:pos="1260"/>
-        </w:tabs>
-        <w:rPr>
-          <w:sz w:val="22"/>
-          <w:szCs w:val="22"/>
-        </w:rPr>
-      </w:pPr>
-      <w:r>
-        <w:rPr>
-          <w:sz w:val="22"/>
-          <w:szCs w:val="22"/>
-        </w:rPr>
         <w:t>Sharing through the w</w:t>
       </w:r>
       <w:r>
@@ -2534,23 +2480,7 @@
           <w:sz w:val="22"/>
           <w:szCs w:val="22"/>
         </w:rPr>
-        <w:t>Al-</w:t>
-      </w:r>
-      <w:proofErr w:type="spellStart"/>
-      <w:r>
-        <w:rPr>
-          <w:sz w:val="22"/>
-          <w:szCs w:val="22"/>
-        </w:rPr>
-        <w:t>Debei</w:t>
-      </w:r>
-      <w:proofErr w:type="spellEnd"/>
-      <w:r>
-        <w:rPr>
-          <w:sz w:val="22"/>
-          <w:szCs w:val="22"/>
-        </w:rPr>
-        <w:t>, M.M., Akroush, M.N. and Ashouri, M.I. (2015) Consumer attitudes towards online shopping: The effects of trust, perceived benefits, and perceived web quality. Internet Research, 25(5), pp. 707–733.</w:t>
+        <w:t>Al-Debei, M.M., Akroush, M.N. and Ashouri, M.I. (2015) Consumer attitudes towards online shopping: The effects of trust, perceived benefits, and perceived web quality. Internet Research, 25(5), pp. 707–733.</w:t>
       </w:r>
     </w:p>
     <w:sectPr>
@@ -3062,6 +2992,155 @@
     </w:lvl>
   </w:abstractNum>
   <w:abstractNum w:abstractNumId="4" w15:restartNumberingAfterBreak="0">
+    <w:nsid w:val="1B112317"/>
+    <w:multiLevelType w:val="multilevel"/>
+    <w:tmpl w:val="B5F40790"/>
+    <w:lvl w:ilvl="0">
+      <w:start w:val="1"/>
+      <w:numFmt w:val="bullet"/>
+      <w:lvlText w:val=""/>
+      <w:lvlJc w:val="left"/>
+      <w:pPr>
+        <w:tabs>
+          <w:tab w:val="num" w:pos="720"/>
+        </w:tabs>
+        <w:ind w:left="720" w:hanging="360"/>
+      </w:pPr>
+      <w:rPr>
+        <w:rFonts w:ascii="Symbol" w:hAnsi="Symbol" w:hint="default"/>
+        <w:sz w:val="20"/>
+      </w:rPr>
+    </w:lvl>
+    <w:lvl w:ilvl="1" w:tentative="1">
+      <w:start w:val="1"/>
+      <w:numFmt w:val="bullet"/>
+      <w:lvlText w:val="o"/>
+      <w:lvlJc w:val="left"/>
+      <w:pPr>
+        <w:tabs>
+          <w:tab w:val="num" w:pos="1440"/>
+        </w:tabs>
+        <w:ind w:left="1440" w:hanging="360"/>
+      </w:pPr>
+      <w:rPr>
+        <w:rFonts w:ascii="Courier New" w:hAnsi="Courier New" w:hint="default"/>
+        <w:sz w:val="20"/>
+      </w:rPr>
+    </w:lvl>
+    <w:lvl w:ilvl="2" w:tentative="1">
+      <w:start w:val="1"/>
+      <w:numFmt w:val="bullet"/>
+      <w:lvlText w:val=""/>
+      <w:lvlJc w:val="left"/>
+      <w:pPr>
+        <w:tabs>
+          <w:tab w:val="num" w:pos="2160"/>
+        </w:tabs>
+        <w:ind w:left="2160" w:hanging="360"/>
+      </w:pPr>
+      <w:rPr>
+        <w:rFonts w:ascii="Wingdings" w:hAnsi="Wingdings" w:hint="default"/>
+        <w:sz w:val="20"/>
+      </w:rPr>
+    </w:lvl>
+    <w:lvl w:ilvl="3" w:tentative="1">
+      <w:start w:val="1"/>
+      <w:numFmt w:val="bullet"/>
+      <w:lvlText w:val=""/>
+      <w:lvlJc w:val="left"/>
+      <w:pPr>
+        <w:tabs>
+          <w:tab w:val="num" w:pos="2880"/>
+        </w:tabs>
+        <w:ind w:left="2880" w:hanging="360"/>
+      </w:pPr>
+      <w:rPr>
+        <w:rFonts w:ascii="Wingdings" w:hAnsi="Wingdings" w:hint="default"/>
+        <w:sz w:val="20"/>
+      </w:rPr>
+    </w:lvl>
+    <w:lvl w:ilvl="4" w:tentative="1">
+      <w:start w:val="1"/>
+      <w:numFmt w:val="bullet"/>
+      <w:lvlText w:val=""/>
+      <w:lvlJc w:val="left"/>
+      <w:pPr>
+        <w:tabs>
+          <w:tab w:val="num" w:pos="3600"/>
+        </w:tabs>
+        <w:ind w:left="3600" w:hanging="360"/>
+      </w:pPr>
+      <w:rPr>
+        <w:rFonts w:ascii="Wingdings" w:hAnsi="Wingdings" w:hint="default"/>
+        <w:sz w:val="20"/>
+      </w:rPr>
+    </w:lvl>
+    <w:lvl w:ilvl="5" w:tentative="1">
+      <w:start w:val="1"/>
+      <w:numFmt w:val="bullet"/>
+      <w:lvlText w:val=""/>
+      <w:lvlJc w:val="left"/>
+      <w:pPr>
+        <w:tabs>
+          <w:tab w:val="num" w:pos="4320"/>
+        </w:tabs>
+        <w:ind w:left="4320" w:hanging="360"/>
+      </w:pPr>
+      <w:rPr>
+        <w:rFonts w:ascii="Wingdings" w:hAnsi="Wingdings" w:hint="default"/>
+        <w:sz w:val="20"/>
+      </w:rPr>
+    </w:lvl>
+    <w:lvl w:ilvl="6" w:tentative="1">
+      <w:start w:val="1"/>
+      <w:numFmt w:val="bullet"/>
+      <w:lvlText w:val=""/>
+      <w:lvlJc w:val="left"/>
+      <w:pPr>
+        <w:tabs>
+          <w:tab w:val="num" w:pos="5040"/>
+        </w:tabs>
+        <w:ind w:left="5040" w:hanging="360"/>
+      </w:pPr>
+      <w:rPr>
+        <w:rFonts w:ascii="Wingdings" w:hAnsi="Wingdings" w:hint="default"/>
+        <w:sz w:val="20"/>
+      </w:rPr>
+    </w:lvl>
+    <w:lvl w:ilvl="7" w:tentative="1">
+      <w:start w:val="1"/>
+      <w:numFmt w:val="bullet"/>
+      <w:lvlText w:val=""/>
+      <w:lvlJc w:val="left"/>
+      <w:pPr>
+        <w:tabs>
+          <w:tab w:val="num" w:pos="5760"/>
+        </w:tabs>
+        <w:ind w:left="5760" w:hanging="360"/>
+      </w:pPr>
+      <w:rPr>
+        <w:rFonts w:ascii="Wingdings" w:hAnsi="Wingdings" w:hint="default"/>
+        <w:sz w:val="20"/>
+      </w:rPr>
+    </w:lvl>
+    <w:lvl w:ilvl="8" w:tentative="1">
+      <w:start w:val="1"/>
+      <w:numFmt w:val="bullet"/>
+      <w:lvlText w:val=""/>
+      <w:lvlJc w:val="left"/>
+      <w:pPr>
+        <w:tabs>
+          <w:tab w:val="num" w:pos="6480"/>
+        </w:tabs>
+        <w:ind w:left="6480" w:hanging="360"/>
+      </w:pPr>
+      <w:rPr>
+        <w:rFonts w:ascii="Wingdings" w:hAnsi="Wingdings" w:hint="default"/>
+        <w:sz w:val="20"/>
+      </w:rPr>
+    </w:lvl>
+  </w:abstractNum>
+  <w:abstractNum w:abstractNumId="5" w15:restartNumberingAfterBreak="0">
     <w:nsid w:val="1CCE4870"/>
     <w:multiLevelType w:val="hybridMultilevel"/>
     <w:tmpl w:val="AEBE3254"/>
@@ -3174,7 +3253,7 @@
       </w:rPr>
     </w:lvl>
   </w:abstractNum>
-  <w:abstractNum w:abstractNumId="5" w15:restartNumberingAfterBreak="0">
+  <w:abstractNum w:abstractNumId="6" w15:restartNumberingAfterBreak="0">
     <w:nsid w:val="2658486E"/>
     <w:multiLevelType w:val="hybridMultilevel"/>
     <w:tmpl w:val="4F26B7BE"/>
@@ -3287,7 +3366,7 @@
       </w:rPr>
     </w:lvl>
   </w:abstractNum>
-  <w:abstractNum w:abstractNumId="6" w15:restartNumberingAfterBreak="0">
+  <w:abstractNum w:abstractNumId="7" w15:restartNumberingAfterBreak="0">
     <w:nsid w:val="45EC3789"/>
     <w:multiLevelType w:val="multilevel"/>
     <w:tmpl w:val="7500E462"/>
@@ -3436,7 +3515,7 @@
       </w:rPr>
     </w:lvl>
   </w:abstractNum>
-  <w:abstractNum w:abstractNumId="7" w15:restartNumberingAfterBreak="0">
+  <w:abstractNum w:abstractNumId="8" w15:restartNumberingAfterBreak="0">
     <w:nsid w:val="503C59CF"/>
     <w:multiLevelType w:val="multilevel"/>
     <w:tmpl w:val="2B6AFCD2"/>
@@ -3585,7 +3664,7 @@
       </w:rPr>
     </w:lvl>
   </w:abstractNum>
-  <w:abstractNum w:abstractNumId="8" w15:restartNumberingAfterBreak="0">
+  <w:abstractNum w:abstractNumId="9" w15:restartNumberingAfterBreak="0">
     <w:nsid w:val="63FE4BCD"/>
     <w:multiLevelType w:val="hybridMultilevel"/>
     <w:tmpl w:val="81566452"/>
@@ -3698,7 +3777,7 @@
       </w:rPr>
     </w:lvl>
   </w:abstractNum>
-  <w:abstractNum w:abstractNumId="9" w15:restartNumberingAfterBreak="0">
+  <w:abstractNum w:abstractNumId="10" w15:restartNumberingAfterBreak="0">
     <w:nsid w:val="64A139AE"/>
     <w:multiLevelType w:val="multilevel"/>
     <w:tmpl w:val="0DDE616E"/>
@@ -3847,7 +3926,7 @@
       </w:rPr>
     </w:lvl>
   </w:abstractNum>
-  <w:abstractNum w:abstractNumId="10" w15:restartNumberingAfterBreak="0">
+  <w:abstractNum w:abstractNumId="11" w15:restartNumberingAfterBreak="0">
     <w:nsid w:val="688A36A4"/>
     <w:multiLevelType w:val="multilevel"/>
     <w:tmpl w:val="C2D62A0E"/>
@@ -3996,7 +4075,7 @@
       </w:rPr>
     </w:lvl>
   </w:abstractNum>
-  <w:abstractNum w:abstractNumId="11" w15:restartNumberingAfterBreak="0">
+  <w:abstractNum w:abstractNumId="12" w15:restartNumberingAfterBreak="0">
     <w:nsid w:val="7A167E0D"/>
     <w:multiLevelType w:val="hybridMultilevel"/>
     <w:tmpl w:val="184C89F2"/>
@@ -4109,7 +4188,7 @@
     </w:lvl>
   </w:abstractNum>
   <w:num w:numId="1" w16cid:durableId="1473056811">
-    <w:abstractNumId w:val="10"/>
+    <w:abstractNumId w:val="11"/>
   </w:num>
   <w:num w:numId="2" w16cid:durableId="1744840184">
     <w:abstractNumId w:val="2"/>
@@ -4118,31 +4197,34 @@
     <w:abstractNumId w:val="1"/>
   </w:num>
   <w:num w:numId="4" w16cid:durableId="209339688">
+    <w:abstractNumId w:val="10"/>
+  </w:num>
+  <w:num w:numId="5" w16cid:durableId="1625817727">
+    <w:abstractNumId w:val="12"/>
+  </w:num>
+  <w:num w:numId="6" w16cid:durableId="1152062743">
     <w:abstractNumId w:val="9"/>
   </w:num>
-  <w:num w:numId="5" w16cid:durableId="1625817727">
-    <w:abstractNumId w:val="11"/>
+  <w:num w:numId="7" w16cid:durableId="1502745117">
+    <w:abstractNumId w:val="6"/>
   </w:num>
-  <w:num w:numId="6" w16cid:durableId="1152062743">
-    <w:abstractNumId w:val="8"/>
-  </w:num>
-  <w:num w:numId="7" w16cid:durableId="1502745117">
+  <w:num w:numId="8" w16cid:durableId="1620797510">
     <w:abstractNumId w:val="5"/>
   </w:num>
-  <w:num w:numId="8" w16cid:durableId="1620797510">
-    <w:abstractNumId w:val="4"/>
-  </w:num>
   <w:num w:numId="9" w16cid:durableId="431321496">
-    <w:abstractNumId w:val="6"/>
+    <w:abstractNumId w:val="7"/>
   </w:num>
   <w:num w:numId="10" w16cid:durableId="796295130">
     <w:abstractNumId w:val="3"/>
   </w:num>
   <w:num w:numId="11" w16cid:durableId="1301151956">
-    <w:abstractNumId w:val="7"/>
+    <w:abstractNumId w:val="8"/>
   </w:num>
   <w:num w:numId="12" w16cid:durableId="2118136409">
     <w:abstractNumId w:val="0"/>
+  </w:num>
+  <w:num w:numId="13" w16cid:durableId="836504663">
+    <w:abstractNumId w:val="4"/>
   </w:num>
 </w:numbering>
 </file>
@@ -4750,7 +4832,6 @@
   <w:style w:type="character" w:default="1" w:styleId="DefaultParagraphFont">
     <w:name w:val="Default Paragraph Font"/>
     <w:uiPriority w:val="1"/>
-    <w:semiHidden/>
     <w:unhideWhenUsed/>
   </w:style>
   <w:style w:type="table" w:default="1" w:styleId="TableNormal">
@@ -5453,6 +5534,14 @@
 </file>
 
 <file path=customXml/item1.xml><?xml version="1.0" encoding="utf-8"?>
+<p:properties xmlns:p="http://schemas.microsoft.com/office/2006/metadata/properties" xmlns:xsi="http://www.w3.org/2001/XMLSchema-instance" xmlns:pc="http://schemas.microsoft.com/office/infopath/2007/PartnerControls">
+  <documentManagement>
+    <_activity xmlns="1de28f1c-007b-496f-9e57-adabd9e280c9" xsi:nil="true"/>
+  </documentManagement>
+</p:properties>
+</file>
+
+<file path=customXml/item2.xml><?xml version="1.0" encoding="utf-8"?>
 <ct:contentTypeSchema xmlns:ct="http://schemas.microsoft.com/office/2006/metadata/contentType" xmlns:ma="http://schemas.microsoft.com/office/2006/metadata/properties/metaAttributes" ct:_="" ma:_="" ma:contentTypeName="Document" ma:contentTypeID="0x0101004CB531A4BAE76840820541C424F6EA57" ma:contentTypeVersion="10" ma:contentTypeDescription="Create a new document." ma:contentTypeScope="" ma:versionID="34a67bd584f1c6341890b21f64d25677">
   <xsd:schema xmlns:xsd="http://www.w3.org/2001/XMLSchema" xmlns:xs="http://www.w3.org/2001/XMLSchema" xmlns:p="http://schemas.microsoft.com/office/2006/metadata/properties" xmlns:ns3="1de28f1c-007b-496f-9e57-adabd9e280c9" targetNamespace="http://schemas.microsoft.com/office/2006/metadata/properties" ma:root="true" ma:fieldsID="b5737d16d8306c02d82cbc8025289502" ns3:_="">
     <xsd:import namespace="1de28f1c-007b-496f-9e57-adabd9e280c9"/>
@@ -5634,19 +5723,7 @@
 </ct:contentTypeSchema>
 </file>
 
-<file path=customXml/item2.xml><?xml version="1.0" encoding="utf-8"?>
-<p:properties xmlns:p="http://schemas.microsoft.com/office/2006/metadata/properties" xmlns:xsi="http://www.w3.org/2001/XMLSchema-instance" xmlns:pc="http://schemas.microsoft.com/office/infopath/2007/PartnerControls">
-  <documentManagement>
-    <_activity xmlns="1de28f1c-007b-496f-9e57-adabd9e280c9" xsi:nil="true"/>
-  </documentManagement>
-</p:properties>
-</file>
-
 <file path=customXml/item3.xml><?xml version="1.0" encoding="utf-8"?>
-<b:Sources xmlns:b="http://schemas.openxmlformats.org/officeDocument/2006/bibliography" xmlns="http://schemas.openxmlformats.org/officeDocument/2006/bibliography" SelectedStyle="\APASixthEditionOfficeOnline.xsl" StyleName="APA" Version="6"/>
-</file>
-
-<file path=customXml/item4.xml><?xml version="1.0" encoding="utf-8"?>
 <?mso-contentType ?>
 <FormTemplates xmlns="http://schemas.microsoft.com/sharepoint/v3/contenttype/forms">
   <Display>DocumentLibraryForm</Display>
@@ -5655,7 +5732,21 @@
 </FormTemplates>
 </file>
 
+<file path=customXml/item4.xml><?xml version="1.0" encoding="utf-8"?>
+<b:Sources xmlns:b="http://schemas.openxmlformats.org/officeDocument/2006/bibliography" xmlns="http://schemas.openxmlformats.org/officeDocument/2006/bibliography" SelectedStyle="\APASixthEditionOfficeOnline.xsl" StyleName="APA" Version="6"/>
+</file>
+
 <file path=customXml/itemProps1.xml><?xml version="1.0" encoding="utf-8"?>
+<ds:datastoreItem xmlns:ds="http://schemas.openxmlformats.org/officeDocument/2006/customXml" ds:itemID="{A8B27579-3557-4E9F-AFB2-7CC9FEE8F5D8}">
+  <ds:schemaRefs>
+    <ds:schemaRef ds:uri="http://schemas.microsoft.com/office/2006/metadata/properties"/>
+    <ds:schemaRef ds:uri="http://schemas.microsoft.com/office/infopath/2007/PartnerControls"/>
+    <ds:schemaRef ds:uri="1de28f1c-007b-496f-9e57-adabd9e280c9"/>
+  </ds:schemaRefs>
+</ds:datastoreItem>
+</file>
+
+<file path=customXml/itemProps2.xml><?xml version="1.0" encoding="utf-8"?>
 <ds:datastoreItem xmlns:ds="http://schemas.openxmlformats.org/officeDocument/2006/customXml" ds:itemID="{85456AFB-E129-4051-9392-03DB04B64046}">
   <ds:schemaRefs>
     <ds:schemaRef ds:uri="http://schemas.microsoft.com/office/2006/metadata/contentType"/>
@@ -5673,28 +5764,18 @@
 </ds:datastoreItem>
 </file>
 
-<file path=customXml/itemProps2.xml><?xml version="1.0" encoding="utf-8"?>
-<ds:datastoreItem xmlns:ds="http://schemas.openxmlformats.org/officeDocument/2006/customXml" ds:itemID="{A8B27579-3557-4E9F-AFB2-7CC9FEE8F5D8}">
+<file path=customXml/itemProps3.xml><?xml version="1.0" encoding="utf-8"?>
+<ds:datastoreItem xmlns:ds="http://schemas.openxmlformats.org/officeDocument/2006/customXml" ds:itemID="{950AC91A-B7E8-43FE-82D8-B0C14F0F5D68}">
   <ds:schemaRefs>
-    <ds:schemaRef ds:uri="http://schemas.microsoft.com/office/2006/metadata/properties"/>
-    <ds:schemaRef ds:uri="http://schemas.microsoft.com/office/infopath/2007/PartnerControls"/>
-    <ds:schemaRef ds:uri="1de28f1c-007b-496f-9e57-adabd9e280c9"/>
+    <ds:schemaRef ds:uri="http://schemas.microsoft.com/sharepoint/v3/contenttype/forms"/>
   </ds:schemaRefs>
 </ds:datastoreItem>
 </file>
 
-<file path=customXml/itemProps3.xml><?xml version="1.0" encoding="utf-8"?>
+<file path=customXml/itemProps4.xml><?xml version="1.0" encoding="utf-8"?>
 <ds:datastoreItem xmlns:ds="http://schemas.openxmlformats.org/officeDocument/2006/customXml" ds:itemID="{88365FA8-1A29-4A52-BF01-FB8E62F0AC77}">
   <ds:schemaRefs>
     <ds:schemaRef ds:uri="http://schemas.openxmlformats.org/officeDocument/2006/bibliography"/>
   </ds:schemaRefs>
 </ds:datastoreItem>
-</file>
-
-<file path=customXml/itemProps4.xml><?xml version="1.0" encoding="utf-8"?>
-<ds:datastoreItem xmlns:ds="http://schemas.openxmlformats.org/officeDocument/2006/customXml" ds:itemID="{950AC91A-B7E8-43FE-82D8-B0C14F0F5D68}">
-  <ds:schemaRefs>
-    <ds:schemaRef ds:uri="http://schemas.microsoft.com/sharepoint/v3/contenttype/forms"/>
-  </ds:schemaRefs>
-</ds:datastoreItem>
 </file>
</xml_diff>